<commit_message>
docs(prof): guide prof Groq 70b + version EN
- build_install_guides.py : exemple Groq recommandé gpt-oss-20b →
  groq/llama-3.3-70b-versatile + note (reasoning rend vide, check clé).
- Régénère GUIDE-INSTALL-PROF.docx (FR).
- Ajoute build_install_guides_en.py (réutilise les helpers FR, prose EN)
  + GUIDE-INSTALL-PROF-EN.docx (parité EN complète).

Co-Authored-By: Claude Opus 4.8 (1M context) <noreply@anthropic.com>
</commit_message>
<xml_diff>
--- a/docs/GUIDE-INSTALL-PROF.docx
+++ b/docs/GUIDE-INSTALL-PROF.docx
@@ -2111,7 +2111,7 @@
               <w:rPr>
                 <w:sz w:val="20"/>
               </w:rPr>
-              <w:t>Groq</w:t>
+              <w:t>Groq (recommande)</w:t>
             </w:r>
           </w:p>
         </w:tc>
@@ -2139,7 +2139,7 @@
               <w:rPr>
                 <w:sz w:val="20"/>
               </w:rPr>
-              <w:t>groq/openai/gpt-oss-20b</w:t>
+              <w:t>groq/llama-3.3-70b-versatile</w:t>
             </w:r>
           </w:p>
         </w:tc>
@@ -2361,7 +2361,7 @@
           <w:rFonts w:ascii="Consolas" w:hAnsi="Consolas"/>
           <w:sz w:val="19"/>
         </w:rPr>
-        <w:t>LITELLM_MODEL=groq/openai/gpt-oss-20b</w:t>
+        <w:t>LITELLM_MODEL=groq/llama-3.3-70b-versatile</w:t>
       </w:r>
     </w:p>
     <w:p>
@@ -2407,6 +2407,17 @@
       <w:pPr>
         <w:spacing w:after="80"/>
       </w:pPr>
+    </w:p>
+    <w:p>
+      <w:pPr>
+        <w:shd w:val="clear" w:fill="FFF4D6"/>
+      </w:pPr>
+      <w:r>
+        <w:rPr>
+          <w:sz w:val="21"/>
+        </w:rPr>
+        <w:t>Modele Groq : prends groq/llama-3.3-70b-versatile (non-reasoning, fiable). Evite groq/openai/gpt-oss-20b — modele reasoning qui renvoie souvent du vide (teste : HTTP 500 / response vide sur certains labs). Cle valide = commence par gsk_ et renvoie 200 sur https://api.groq.com/openai/v1/models (401 = invalide).</w:t>
+      </w:r>
     </w:p>
     <w:p>
       <w:pPr>

</xml_diff>